<commit_message>
fix: remove vocab.json from retrieval submission list and fix caption indentation bug
- Remove work/vocab.json row from retrieval DOCX submission table (vocab
  is already saved inside the .pt checkpoint file)
- Remove work/vocab.json row from both retrieval notebook submission lists
  (student and answer versions)
- Fix indentation bug in caption answer notebook evaluate_caption function
  (texts = model.generate_by_beamsearch line had 16 spaces instead of 12)
- Update caption notebooks from latest uploaded versions

Co-Authored-By: Claude Opus 4.6 <noreply@anthropic.com>
Claude-Session: https://claude.ai/code/session_01SQiDRiidEff2ExZ4BK9aXC
</commit_message>
<xml_diff>
--- a/notebooks/retrieval作业要求.docx
+++ b/notebooks/retrieval作业要求.docx
@@ -655,62 +655,6 @@
                 <w:szCs w:val="20"/>
               </w:rPr>
               <w:t>训练好的模型权重（含 model、vocab、vocab_size、backbone）</w:t>
-            </w:r>
-          </w:p>
-        </w:tc>
-      </w:tr>
-      <w:tr>
-        <w:tc>
-          <w:tcPr>
-            <w:tcW w:w="4000" w:type="dxa"/>
-            <w:tcBorders>
-              <w:top w:val="single" w:sz="1" w:space="0" w:color="BBBBBB"/>
-              <w:left w:val="single" w:sz="1" w:space="0" w:color="BBBBBB"/>
-              <w:bottom w:val="single" w:sz="1" w:space="0" w:color="BBBBBB"/>
-              <w:right w:val="single" w:sz="1" w:space="0" w:color="BBBBBB"/>
-            </w:tcBorders>
-            <w:tcMar>
-              <w:top w:w="80" w:type="dxa"/>
-              <w:left w:w="120" w:type="dxa"/>
-              <w:bottom w:w="80" w:type="dxa"/>
-              <w:right w:w="120" w:type="dxa"/>
-            </w:tcMar>
-          </w:tcPr>
-          <w:p>
-            <w:r>
-              <w:rPr>
-                <w:rFonts w:ascii="Consolas" w:eastAsia="Consolas" w:hAnsi="Consolas" w:cs="Consolas"/>
-                <w:color w:val="2B5EA7"/>
-                <w:sz w:val="18"/>
-                <w:szCs w:val="18"/>
-              </w:rPr>
-              <w:t>work/vocab.json</w:t>
-            </w:r>
-          </w:p>
-        </w:tc>
-        <w:tc>
-          <w:tcPr>
-            <w:tcW w:w="5026" w:type="dxa"/>
-            <w:tcBorders>
-              <w:top w:val="single" w:sz="1" w:space="0" w:color="BBBBBB"/>
-              <w:left w:val="single" w:sz="1" w:space="0" w:color="BBBBBB"/>
-              <w:bottom w:val="single" w:sz="1" w:space="0" w:color="BBBBBB"/>
-              <w:right w:val="single" w:sz="1" w:space="0" w:color="BBBBBB"/>
-            </w:tcBorders>
-            <w:tcMar>
-              <w:top w:w="80" w:type="dxa"/>
-              <w:left w:w="120" w:type="dxa"/>
-              <w:bottom w:w="80" w:type="dxa"/>
-              <w:right w:w="120" w:type="dxa"/>
-            </w:tcMar>
-          </w:tcPr>
-          <w:p>
-            <w:r>
-              <w:rPr>
-                <w:sz w:val="20"/>
-                <w:szCs w:val="20"/>
-              </w:rPr>
-              <w:t>训练时生成的词表文件（教师评估时需要加载）</w:t>
             </w:r>
           </w:p>
         </w:tc>

</xml_diff>